<commit_message>
Add GitHub repository link to documentation
</commit_message>
<xml_diff>
--- a/Flask_and_MongoDB_Assignment_PratheeshBabu.docx
+++ b/Flask_and_MongoDB_Assignment_PratheeshBabu.docx
@@ -532,12 +532,12 @@
           <wp:inline distB="114300" distT="114300" distL="114300" distR="114300">
             <wp:extent cx="5943600" cy="5613400"/>
             <wp:effectExtent b="0" l="0" r="0" t="0"/>
-            <wp:docPr id="2" name="image2.png"/>
+            <wp:docPr id="2" name="image3.png"/>
             <a:graphic>
               <a:graphicData uri="http://schemas.openxmlformats.org/drawingml/2006/picture">
                 <pic:pic>
                   <pic:nvPicPr>
-                    <pic:cNvPr id="0" name="image2.png"/>
+                    <pic:cNvPr id="0" name="image3.png"/>
                     <pic:cNvPicPr preferRelativeResize="0"/>
                   </pic:nvPicPr>
                   <pic:blipFill>
@@ -1005,12 +1005,12 @@
           <wp:inline distB="114300" distT="114300" distL="114300" distR="114300">
             <wp:extent cx="5943600" cy="2286000"/>
             <wp:effectExtent b="0" l="0" r="0" t="0"/>
-            <wp:docPr id="3" name="image3.png"/>
+            <wp:docPr id="3" name="image2.png"/>
             <a:graphic>
               <a:graphicData uri="http://schemas.openxmlformats.org/drawingml/2006/picture">
                 <pic:pic>
                   <pic:nvPicPr>
-                    <pic:cNvPr id="0" name="image3.png"/>
+                    <pic:cNvPr id="0" name="image2.png"/>
                     <pic:cNvPicPr preferRelativeResize="0"/>
                   </pic:nvPicPr>
                   <pic:blipFill>
@@ -1774,7 +1774,26 @@
           <w:szCs w:val="24"/>
           <w:rtl w:val="0"/>
         </w:rPr>
-        <w:t xml:space="preserve">Repository URL: Add the GitHub repository URL after creating the repository. </w:t>
+        <w:t xml:space="preserve">Repository URL: https://github.com/pratheeshbabus/Flask_and_MongoDB_PratheeshBabu</w:t>
+      </w:r>
+    </w:p>
+    <w:p>
+      <w:pPr>
+        <w:pBdr>
+          <w:left w:color="auto" w:space="0" w:sz="0" w:val="none"/>
+          <w:right w:color="auto" w:space="0" w:sz="0" w:val="none"/>
+        </w:pBdr>
+        <w:spacing w:after="240" w:before="240" w:lineRule="auto"/>
+        <w:rPr>
+          <w:rFonts w:ascii="Calibri" w:cs="Calibri" w:eastAsia="Calibri" w:hAnsi="Calibri"/>
+          <w:sz w:val="24"/>
+          <w:szCs w:val="24"/>
+        </w:rPr>
+      </w:pPr>
+      <w:r>
+        <w:rPr>
+          <w:rtl w:val="0"/>
+        </w:rPr>
       </w:r>
     </w:p>
     <w:p>

</xml_diff>